<commit_message>
Update QdC & Create Gant
</commit_message>
<xml_diff>
--- a/1_QdC/QdC_PokeCardDex.docx
+++ b/1_QdC/QdC_PokeCardDex.docx
@@ -94,7 +94,7 @@
               </wp:inline>
             </w:drawing>
           </mc:Choice>
-          <mc:Fallback xmlns:w16du="http://schemas.microsoft.com/office/word/2023/wordml/word16du" xmlns:w16sdtfl="http://schemas.microsoft.com/office/word/2024/wordml/sdtformatlock">
+          <mc:Fallback xmlns:w16sdtfl="http://schemas.microsoft.com/office/word/2024/wordml/sdtformatlock" xmlns:w16du="http://schemas.microsoft.com/office/word/2023/wordml/word16du">
             <w:pict>
               <v:group w14:anchorId="70E73CBE" id="docshapegroup5" o:spid="_x0000_s1026" style="width:484.95pt;height:.5pt;mso-position-horizontal-relative:char;mso-position-vertical-relative:line" coordsize="9699,10" o:gfxdata="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">
                 <v:rect id="docshape6" o:spid="_x0000_s1027" style="position:absolute;width:9699;height:10;visibility:visible;mso-wrap-style:square;v-text-anchor:top" o:gfxdata="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" fillcolor="black" stroked="f"/>
@@ -1666,7 +1666,7 @@
               </wp:anchor>
             </w:drawing>
           </mc:Choice>
-          <mc:Fallback xmlns:w16du="http://schemas.microsoft.com/office/word/2023/wordml/word16du" xmlns:w16sdtfl="http://schemas.microsoft.com/office/word/2024/wordml/sdtformatlock">
+          <mc:Fallback xmlns:w16sdtfl="http://schemas.microsoft.com/office/word/2024/wordml/sdtformatlock" xmlns:w16du="http://schemas.microsoft.com/office/word/2023/wordml/word16du">
             <w:pict>
               <v:rect w14:anchorId="7AF32B45" id="docshape7" o:spid="_x0000_s1026" style="position:absolute;margin-left:55.2pt;margin-top:18.6pt;width:484.9pt;height:.5pt;z-index:-15728128;visibility:visible;mso-wrap-style:square;mso-width-percent:0;mso-height-percent:0;mso-wrap-distance-left:0;mso-wrap-distance-top:0;mso-wrap-distance-right:0;mso-wrap-distance-bottom:0;mso-position-horizontal:absolute;mso-position-horizontal-relative:page;mso-position-vertical:absolute;mso-position-vertical-relative:text;mso-width-percent:0;mso-height-percent:0;mso-width-relative:page;mso-height-relative:page;v-text-anchor:top" o:gfxdata="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" fillcolor="black" stroked="f">
                 <w10:wrap type="topAndBottom" anchorx="page"/>
@@ -2635,7 +2635,7 @@
               </wp:inline>
             </w:drawing>
           </mc:Choice>
-          <mc:Fallback xmlns:w16du="http://schemas.microsoft.com/office/word/2023/wordml/word16du" xmlns:w16sdtfl="http://schemas.microsoft.com/office/word/2024/wordml/sdtformatlock">
+          <mc:Fallback xmlns:w16sdtfl="http://schemas.microsoft.com/office/word/2024/wordml/sdtformatlock" xmlns:w16du="http://schemas.microsoft.com/office/word/2023/wordml/word16du">
             <w:pict>
               <v:group w14:anchorId="2E328116" id="docshapegroup8" o:spid="_x0000_s1026" style="width:484.95pt;height:.5pt;mso-position-horizontal-relative:char;mso-position-vertical-relative:line" coordsize="9699,10" o:gfxdata="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">
                 <v:rect id="docshape9" o:spid="_x0000_s1027" style="position:absolute;width:9699;height:10;visibility:visible;mso-wrap-style:square;v-text-anchor:top" o:gfxdata="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" fillcolor="black" stroked="f"/>
@@ -2765,7 +2765,7 @@
               </wp:anchor>
             </w:drawing>
           </mc:Choice>
-          <mc:Fallback xmlns:w16du="http://schemas.microsoft.com/office/word/2023/wordml/word16du" xmlns:w16sdtfl="http://schemas.microsoft.com/office/word/2024/wordml/sdtformatlock">
+          <mc:Fallback xmlns:w16sdtfl="http://schemas.microsoft.com/office/word/2024/wordml/sdtformatlock" xmlns:w16du="http://schemas.microsoft.com/office/word/2023/wordml/word16du">
             <w:pict>
               <v:rect w14:anchorId="73131EAD" id="docshape10" o:spid="_x0000_s1026" style="position:absolute;margin-left:55.2pt;margin-top:18.05pt;width:484.9pt;height:.5pt;z-index:-15721472;visibility:visible;mso-wrap-style:square;mso-width-percent:0;mso-height-percent:0;mso-wrap-distance-left:0;mso-wrap-distance-top:0;mso-wrap-distance-right:0;mso-wrap-distance-bottom:0;mso-position-horizontal:absolute;mso-position-horizontal-relative:page;mso-position-vertical:absolute;mso-position-vertical-relative:text;mso-width-percent:0;mso-height-percent:0;mso-width-relative:page;mso-height-relative:page;v-text-anchor:top" o:gfxdata="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" fillcolor="black" stroked="f">
                 <w10:wrap type="topAndBottom" anchorx="page"/>
@@ -2921,7 +2921,7 @@
               </wp:anchor>
             </w:drawing>
           </mc:Choice>
-          <mc:Fallback xmlns:w16du="http://schemas.microsoft.com/office/word/2023/wordml/word16du" xmlns:w16sdtfl="http://schemas.microsoft.com/office/word/2024/wordml/sdtformatlock">
+          <mc:Fallback xmlns:w16sdtfl="http://schemas.microsoft.com/office/word/2024/wordml/sdtformatlock" xmlns:w16du="http://schemas.microsoft.com/office/word/2023/wordml/word16du">
             <w:pict>
               <v:rect w14:anchorId="1A8AD331" id="docshape11" o:spid="_x0000_s1026" style="position:absolute;margin-left:55.2pt;margin-top:18.1pt;width:484.9pt;height:.5pt;z-index:-15720448;visibility:visible;mso-wrap-style:square;mso-width-percent:0;mso-height-percent:0;mso-wrap-distance-left:0;mso-wrap-distance-top:0;mso-wrap-distance-right:0;mso-wrap-distance-bottom:0;mso-position-horizontal:absolute;mso-position-horizontal-relative:page;mso-position-vertical:absolute;mso-position-vertical-relative:text;mso-width-percent:0;mso-height-percent:0;mso-width-relative:page;mso-height-relative:page;v-text-anchor:top" o:gfxdata="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" fillcolor="black" stroked="f">
                 <w10:wrap type="topAndBottom" anchorx="page"/>
@@ -3056,7 +3056,7 @@
               </wp:anchor>
             </w:drawing>
           </mc:Choice>
-          <mc:Fallback xmlns:w16du="http://schemas.microsoft.com/office/word/2023/wordml/word16du" xmlns:w16sdtfl="http://schemas.microsoft.com/office/word/2024/wordml/sdtformatlock">
+          <mc:Fallback xmlns:w16sdtfl="http://schemas.microsoft.com/office/word/2024/wordml/sdtformatlock" xmlns:w16du="http://schemas.microsoft.com/office/word/2023/wordml/word16du">
             <w:pict>
               <v:rect w14:anchorId="48EE7F19" id="docshape12" o:spid="_x0000_s1026" style="position:absolute;margin-left:55.2pt;margin-top:18.1pt;width:484.9pt;height:.5pt;z-index:-15719424;visibility:visible;mso-wrap-style:square;mso-width-percent:0;mso-height-percent:0;mso-wrap-distance-left:0;mso-wrap-distance-top:0;mso-wrap-distance-right:0;mso-wrap-distance-bottom:0;mso-position-horizontal:absolute;mso-position-horizontal-relative:page;mso-position-vertical:absolute;mso-position-vertical-relative:text;mso-width-percent:0;mso-height-percent:0;mso-width-relative:page;mso-height-relative:page;v-text-anchor:top" o:gfxdata="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" fillcolor="black" stroked="f">
                 <w10:wrap type="topAndBottom" anchorx="page"/>
@@ -3139,7 +3139,35 @@
           <w:b/>
           <w:bCs/>
         </w:rPr>
-        <w:t>Requisiti:</w:t>
+        <w:t>Requisiti</w:t>
+      </w:r>
+      <w:r>
+        <w:rPr>
+          <w:b/>
+          <w:bCs/>
+        </w:rPr>
+        <w:t xml:space="preserve"> e </w:t>
+      </w:r>
+      <w:r>
+        <w:rPr>
+          <w:b/>
+          <w:bCs/>
+        </w:rPr>
+        <w:t xml:space="preserve">esempi di </w:t>
+      </w:r>
+      <w:r>
+        <w:rPr>
+          <w:b/>
+          <w:bCs/>
+        </w:rPr>
+        <w:t>test</w:t>
+      </w:r>
+      <w:r>
+        <w:rPr>
+          <w:b/>
+          <w:bCs/>
+        </w:rPr>
+        <w:t>:</w:t>
       </w:r>
     </w:p>
     <w:p>
@@ -3165,7 +3193,7 @@
         <w:spacing w:before="56"/>
       </w:pPr>
       <w:r>
-        <w:t>L’accesso può essere fatto anche con il nome utente impostato tramite impostazioni</w:t>
+        <w:t>I dati vengono salvati su un server SQL per tener sicuri i dati</w:t>
       </w:r>
     </w:p>
     <w:p>
@@ -3178,10 +3206,20 @@
         <w:spacing w:before="56"/>
       </w:pPr>
       <w:r>
-        <w:t>Il nome utente deve essere univoco</w:t>
-      </w:r>
-      <w:r>
-        <w:t xml:space="preserve"> come la mail</w:t>
+        <w:t>I dati includono: email dell’utente, password, nome utente, un JSON con le carte pokémon salvate e le loro quantità</w:t>
+      </w:r>
+    </w:p>
+    <w:p>
+      <w:pPr>
+        <w:pStyle w:val="Corpotesto"/>
+        <w:numPr>
+          <w:ilvl w:val="1"/>
+          <w:numId w:val="10"/>
+        </w:numPr>
+        <w:spacing w:before="56"/>
+      </w:pPr>
+      <w:r>
+        <w:t>L’accesso può essere fatto anche con il nome utente impostato tramite impostazioni</w:t>
       </w:r>
     </w:p>
     <w:p>
@@ -3194,10 +3232,23 @@
         <w:spacing w:before="56"/>
       </w:pPr>
       <w:r>
-        <w:t xml:space="preserve">Di </w:t>
-      </w:r>
-      <w:r>
-        <w:t>default sarà la parte di mail prima della ‘@’</w:t>
+        <w:t>Il nome utente deve essere univoco</w:t>
+      </w:r>
+      <w:r>
+        <w:t xml:space="preserve"> come la mail</w:t>
+      </w:r>
+    </w:p>
+    <w:p>
+      <w:pPr>
+        <w:pStyle w:val="Corpotesto"/>
+        <w:numPr>
+          <w:ilvl w:val="2"/>
+          <w:numId w:val="10"/>
+        </w:numPr>
+        <w:spacing w:before="56"/>
+      </w:pPr>
+      <w:r>
+        <w:t>Di default sarà la parte di mail prima della ‘@’</w:t>
       </w:r>
     </w:p>
     <w:p>
@@ -3222,9 +3273,34 @@
     <w:p>
       <w:pPr>
         <w:pStyle w:val="Corpotesto"/>
+        <w:numPr>
+          <w:ilvl w:val="1"/>
+          <w:numId w:val="10"/>
+        </w:numPr>
         <w:spacing w:before="56"/>
-        <w:ind w:left="3164"/>
-      </w:pPr>
+      </w:pPr>
+      <w:r>
+        <w:t>Aggiungere un modo per il recupero password (confermando l’email si invia ad essa un link per la modif</w:t>
+      </w:r>
+      <w:r>
+        <w:t>ica</w:t>
+      </w:r>
+      <w:r>
+        <w:t xml:space="preserve"> della password)</w:t>
+      </w:r>
+    </w:p>
+    <w:p>
+      <w:pPr>
+        <w:pStyle w:val="Corpotesto"/>
+        <w:numPr>
+          <w:ilvl w:val="0"/>
+          <w:numId w:val="10"/>
+        </w:numPr>
+        <w:spacing w:before="56"/>
+      </w:pPr>
+      <w:r>
+        <w:t>L’app dovrà salvare solo carte registrate tramite l’ID della carta, se il pokémon sulla carta non è ancora stato registrato l’app lo aggiunge al pokédex nel rispettivo numero</w:t>
+      </w:r>
     </w:p>
     <w:p>
       <w:pPr>
@@ -3236,13 +3312,7 @@
         <w:spacing w:before="56"/>
       </w:pPr>
       <w:r>
-        <w:t>Aggiungere un modo per il recupero password (confermando l’email si invia ad essa un link per la modif</w:t>
-      </w:r>
-      <w:r>
-        <w:t>ica</w:t>
-      </w:r>
-      <w:r>
-        <w:t xml:space="preserve"> della password)</w:t>
+        <w:t>L’app deve essere aggiornata all’ultima espansione</w:t>
       </w:r>
     </w:p>
     <w:p>
@@ -3255,7 +3325,22 @@
         <w:spacing w:before="56"/>
       </w:pPr>
       <w:r>
-        <w:t>I dati vengono salvati su un server SQL per tener sicuri i dati</w:t>
+        <w:t>Es: Utente aggiunge la carta pokémon di Mega Darkrai</w:t>
+      </w:r>
+      <w:r>
+        <w:t xml:space="preserve">-ex con il codice PBL </w:t>
+      </w:r>
+      <w:r>
+        <w:t>101/83</w:t>
+      </w:r>
+      <w:r>
+        <w:t xml:space="preserve">, non ha ancora salvato alcun Darkrai </w:t>
+      </w:r>
+      <w:r>
+        <w:sym w:font="Wingdings" w:char="F0E0"/>
+      </w:r>
+      <w:r>
+        <w:t xml:space="preserve"> Aggiunge Darkrai nel Pokédex</w:t>
       </w:r>
     </w:p>
     <w:p>
@@ -3268,7 +3353,74 @@
         <w:spacing w:before="56"/>
       </w:pPr>
       <w:r>
-        <w:t>I dati includono: email dell’utente, password, nome utente, un JSON con le carte pokémon salvate e le loro quantità</w:t>
+        <w:t xml:space="preserve">La ricerca </w:t>
+      </w:r>
+      <w:r>
+        <w:t>e</w:t>
+      </w:r>
+      <w:r>
+        <w:t>strae il nome del pokémon nell’eventualità la carta abbia dettagli extra come Mega</w:t>
+      </w:r>
+      <w:r>
+        <w:t xml:space="preserve"> __ex, ex, di x, etc.</w:t>
+      </w:r>
+      <w:r>
+        <w:t xml:space="preserve"> (Es.: Mega Greninja ex </w:t>
+      </w:r>
+      <w:r>
+        <w:sym w:font="Wingdings" w:char="F0E0"/>
+      </w:r>
+      <w:r>
+        <w:t xml:space="preserve"> Greninja; Metagross di Rocco </w:t>
+      </w:r>
+      <w:r>
+        <w:sym w:font="Wingdings" w:char="F0E0"/>
+      </w:r>
+      <w:r>
+        <w:t xml:space="preserve"> Metagross)</w:t>
+      </w:r>
+    </w:p>
+    <w:p>
+      <w:pPr>
+        <w:pStyle w:val="Corpotesto"/>
+        <w:numPr>
+          <w:ilvl w:val="2"/>
+          <w:numId w:val="10"/>
+        </w:numPr>
+        <w:spacing w:before="56"/>
+      </w:pPr>
+      <w:r>
+        <w:t xml:space="preserve">La carta viene salvata secondo le </w:t>
+      </w:r>
+      <w:r>
+        <w:t>necessità</w:t>
+      </w:r>
+      <w:r>
+        <w:t xml:space="preserve"> dell’api “</w:t>
+      </w:r>
+      <w:r>
+        <w:t>tcgdex.dev</w:t>
+      </w:r>
+      <w:r>
+        <w:t xml:space="preserve">”, PBL </w:t>
+      </w:r>
+      <w:r>
+        <w:t>101/83</w:t>
+      </w:r>
+      <w:r>
+        <w:t xml:space="preserve"> </w:t>
+      </w:r>
+      <w:r>
+        <w:sym w:font="Wingdings" w:char="F0E0"/>
+      </w:r>
+      <w:r>
+        <w:t xml:space="preserve"> espansione principale: Megaevoluzione (me), espansione: Buio Pesto (</w:t>
+      </w:r>
+      <w:r>
+        <w:t>Pitch</w:t>
+      </w:r>
+      <w:r>
+        <w:t xml:space="preserve"> Black) (me03), numero carta: 101</w:t>
       </w:r>
     </w:p>
     <w:p>
@@ -3281,7 +3433,26 @@
         <w:spacing w:before="56"/>
       </w:pPr>
       <w:r>
-        <w:t>L’app dovrà salvare solo carte registrate tramite l’ID della carta, se il pokémon sulla carta non è ancora stato registrato l’app lo aggiunge al pokédex nel rispettivo numero</w:t>
+        <w:t xml:space="preserve">L’app deve mostrare il valore della carta </w:t>
+      </w:r>
+      <w:r>
+        <w:t>medio secondo Cardmarket (Il più grande mercato europeo di carte collezionabili) in Fr.-</w:t>
+      </w:r>
+    </w:p>
+    <w:p>
+      <w:pPr>
+        <w:pStyle w:val="Corpotesto"/>
+        <w:numPr>
+          <w:ilvl w:val="0"/>
+          <w:numId w:val="10"/>
+        </w:numPr>
+        <w:spacing w:before="56"/>
+      </w:pPr>
+      <w:r>
+        <w:t>L’app deve simulare un pokédex mostrando nome e immagine di anteprima dei pokémon “scoperti” mentre per quelli dei pokémon non scoperti deve apparire solo il numero del pokédex e un punto d’interrogazione</w:t>
+      </w:r>
+      <w:r>
+        <w:t>.</w:t>
       </w:r>
     </w:p>
     <w:p>
@@ -3294,22 +3465,7 @@
         <w:spacing w:before="56"/>
       </w:pPr>
       <w:r>
-        <w:t>Es: Utente aggiunge la carta pokémon di Mega Darkrai</w:t>
-      </w:r>
-      <w:r>
-        <w:t xml:space="preserve">-ex con il codice PBL </w:t>
-      </w:r>
-      <w:r>
-        <w:t>101/83</w:t>
-      </w:r>
-      <w:r>
-        <w:t xml:space="preserve">, non ha ancora salvato alcun Darkrai </w:t>
-      </w:r>
-      <w:r>
-        <w:sym w:font="Wingdings" w:char="F0E0"/>
-      </w:r>
-      <w:r>
-        <w:t xml:space="preserve"> Aggiunge Darkrai nel Pokédex</w:t>
+        <w:t>Selezionando sul pokémon si deve aprire un’overview del pokémon che includa una sua immagine, le descrizioni delle carte, il suo tipo e eventuali evoluzioni o pre-evoluzioni o forme alternative (Incluse Mega evoluzioni)</w:t>
       </w:r>
     </w:p>
     <w:p>
@@ -3322,31 +3478,7 @@
         <w:spacing w:before="56"/>
       </w:pPr>
       <w:r>
-        <w:t xml:space="preserve">La ricerca </w:t>
-      </w:r>
-      <w:r>
-        <w:t>e</w:t>
-      </w:r>
-      <w:r>
-        <w:t>strae il nome del pokémon nell’eventualità la carta abbia dettagli extra come Mega</w:t>
-      </w:r>
-      <w:r>
-        <w:t xml:space="preserve"> __ex, ex, di x, etc.</w:t>
-      </w:r>
-      <w:r>
-        <w:t xml:space="preserve"> (Es.: Mega Greninja ex </w:t>
-      </w:r>
-      <w:r>
-        <w:sym w:font="Wingdings" w:char="F0E0"/>
-      </w:r>
-      <w:r>
-        <w:t xml:space="preserve"> Greninja; Metagross di Rocco </w:t>
-      </w:r>
-      <w:r>
-        <w:sym w:font="Wingdings" w:char="F0E0"/>
-      </w:r>
-      <w:r>
-        <w:t xml:space="preserve"> Metagross)</w:t>
+        <w:t>Le evoluzioni e pre-evoluzioni devono includere un collegamento ad esse</w:t>
       </w:r>
     </w:p>
     <w:p>
@@ -3359,40 +3491,24 @@
         <w:spacing w:before="56"/>
       </w:pPr>
       <w:r>
-        <w:t xml:space="preserve">La carta viene salvata secondo le </w:t>
-      </w:r>
-      <w:r>
-        <w:t>necessità</w:t>
-      </w:r>
-      <w:r>
-        <w:t xml:space="preserve"> dell’api “</w:t>
-      </w:r>
-      <w:r>
-        <w:t>tcgdex.dev</w:t>
-      </w:r>
-      <w:r>
-        <w:t xml:space="preserve">”, </w:t>
-      </w:r>
-      <w:r>
-        <w:t xml:space="preserve">PBL </w:t>
-      </w:r>
-      <w:r>
-        <w:t>101/83</w:t>
-      </w:r>
-      <w:r>
-        <w:t xml:space="preserve"> </w:t>
-      </w:r>
-      <w:r>
-        <w:sym w:font="Wingdings" w:char="F0E0"/>
-      </w:r>
-      <w:r>
-        <w:t xml:space="preserve"> espansione principale: Megaevoluzione (me), espansione: Buio Pesto (</w:t>
-      </w:r>
-      <w:r>
-        <w:t>Pitch</w:t>
-      </w:r>
-      <w:r>
-        <w:t xml:space="preserve"> Black) (me03), numero carta: 101</w:t>
+        <w:t xml:space="preserve">Se il pokémon non è stato sbloccato la sua scheda deve essere vuota (Punti di domanda la posto dei dati base, nessun collegamento a evoluzioni e pre-evoluzioni </w:t>
+      </w:r>
+      <w:r>
+        <w:lastRenderedPageBreak/>
+        <w:t>e un punto di domanda la posto dell’immagine)</w:t>
+      </w:r>
+    </w:p>
+    <w:p>
+      <w:pPr>
+        <w:pStyle w:val="Corpotesto"/>
+        <w:numPr>
+          <w:ilvl w:val="2"/>
+          <w:numId w:val="10"/>
+        </w:numPr>
+        <w:spacing w:before="56"/>
+      </w:pPr>
+      <w:r>
+        <w:t>Se ho già uno Squirtle dell’espansione Scarlatto e Violetto – 151 e aggiungo uno dell’espansione Megaevoluzione – Promo, la descrizione di quest’ultimo deve essere aggiunta alla descrizione del pokémon</w:t>
       </w:r>
     </w:p>
     <w:p>
@@ -3405,111 +3521,10 @@
         <w:spacing w:before="56"/>
       </w:pPr>
       <w:r>
-        <w:t>L’app deve essere aggiornata all’ultima espansione</w:t>
-      </w:r>
-    </w:p>
-    <w:p>
-      <w:pPr>
-        <w:pStyle w:val="Corpotesto"/>
-        <w:numPr>
-          <w:ilvl w:val="0"/>
-          <w:numId w:val="10"/>
-        </w:numPr>
-        <w:spacing w:before="56"/>
-      </w:pPr>
-      <w:r>
-        <w:t xml:space="preserve">L’app deve mostrare il valore della carta </w:t>
-      </w:r>
-      <w:r>
-        <w:t>medio secondo Cardmarket (Il più grande mercato europeo di carte collezionabili) in Fr.-</w:t>
-      </w:r>
-    </w:p>
-    <w:p>
-      <w:pPr>
-        <w:pStyle w:val="Corpotesto"/>
-        <w:numPr>
-          <w:ilvl w:val="0"/>
-          <w:numId w:val="10"/>
-        </w:numPr>
-        <w:spacing w:before="56"/>
-      </w:pPr>
-      <w:r>
-        <w:t>L’app deve simulare un pokédex mostrando nome e immagine di anteprima dei pokémon “scoperti” mentre per quelli dei pokémon non scoperti deve apparire solo il numero del pokédex e un punto d’interrogazione</w:t>
-      </w:r>
-      <w:r>
-        <w:t>.</w:t>
-      </w:r>
-    </w:p>
-    <w:p>
-      <w:pPr>
-        <w:pStyle w:val="Corpotesto"/>
-        <w:numPr>
-          <w:ilvl w:val="1"/>
-          <w:numId w:val="10"/>
-        </w:numPr>
-        <w:spacing w:before="56"/>
-      </w:pPr>
-      <w:r>
         <w:t>Es.: Utente ha una carta di Bulbasaur e una carta di Mega Venosaur-ex, ma non una di Ivysaur, nel pokédex deve apparire un buco tra Bulbasaur e Venosaur</w:t>
       </w:r>
       <w:r>
         <w:t xml:space="preserve"> con il numero 2</w:t>
-      </w:r>
-    </w:p>
-    <w:p>
-      <w:pPr>
-        <w:pStyle w:val="Corpotesto"/>
-        <w:numPr>
-          <w:ilvl w:val="1"/>
-          <w:numId w:val="10"/>
-        </w:numPr>
-        <w:spacing w:before="56"/>
-      </w:pPr>
-      <w:r>
-        <w:t>Selezionando sul pokémon si deve aprire un’overview del pokémon che includa una sua immagine, le descrizioni delle carte, il suo tipo e eventuali evoluzioni o pre-evoluzioni o forme alternative (Incluse Mega evoluzioni)</w:t>
-      </w:r>
-    </w:p>
-    <w:p>
-      <w:pPr>
-        <w:pStyle w:val="Corpotesto"/>
-        <w:numPr>
-          <w:ilvl w:val="2"/>
-          <w:numId w:val="10"/>
-        </w:numPr>
-        <w:spacing w:before="56"/>
-      </w:pPr>
-      <w:r>
-        <w:lastRenderedPageBreak/>
-        <w:t>Le evoluzioni e pre-evoluzioni devono includere un collegamento ad esse</w:t>
-      </w:r>
-    </w:p>
-    <w:p>
-      <w:pPr>
-        <w:pStyle w:val="Corpotesto"/>
-        <w:numPr>
-          <w:ilvl w:val="2"/>
-          <w:numId w:val="10"/>
-        </w:numPr>
-        <w:spacing w:before="56"/>
-      </w:pPr>
-      <w:r>
-        <w:t>Se il pokémon non è stato sbloccato la sua scheda deve essere vuota (Punti di domanda la posto dei dati base, nessun collegamento a evoluzioni e pre-evoluzioni e un punto di domanda la posto dell’immagine)</w:t>
-      </w:r>
-    </w:p>
-    <w:p>
-      <w:pPr>
-        <w:pStyle w:val="Corpotesto"/>
-        <w:numPr>
-          <w:ilvl w:val="2"/>
-          <w:numId w:val="10"/>
-        </w:numPr>
-        <w:spacing w:before="56"/>
-      </w:pPr>
-      <w:r>
-        <w:t>Se ho già uno Squirtle d</w:t>
-      </w:r>
-      <w:r>
-        <w:t>ell’espansione Scarlatto e Violetto – 151 e aggiungo uno dell’espansione Megaevoluzione – Promo, la descrizione di quest’ultimo deve essere aggiunta alla descrizione del pokémon</w:t>
       </w:r>
     </w:p>
     <w:p>
@@ -3634,16 +3649,7 @@
         <w:spacing w:before="56"/>
       </w:pPr>
       <w:r>
-        <w:t xml:space="preserve">CSS: Linguaggio usato </w:t>
-      </w:r>
-      <w:r>
-        <w:t>per il</w:t>
-      </w:r>
-      <w:r>
-        <w:t xml:space="preserve"> design del</w:t>
-      </w:r>
-      <w:r>
-        <w:t xml:space="preserve"> Front-end dei siti o applicativi web</w:t>
+        <w:t>CSS: Linguaggio usato per il design del Front-end dei siti o applicativi web</w:t>
       </w:r>
     </w:p>
     <w:p>
@@ -3693,6 +3699,7 @@
       <w:r>
         <w:rPr>
           <w:rFonts w:ascii="Calibri Light" w:eastAsia="Calibri Light" w:hAnsi="Calibri Light" w:cs="Calibri Light"/>
+          <w:noProof/>
           <w:color w:val="2E5395"/>
           <w:sz w:val="32"/>
           <w:szCs w:val="32"/>
@@ -3763,7 +3770,7 @@
               </wp:anchor>
             </w:drawing>
           </mc:Choice>
-          <mc:Fallback xmlns:w16du="http://schemas.microsoft.com/office/word/2023/wordml/word16du" xmlns:w16sdtfl="http://schemas.microsoft.com/office/word/2024/wordml/sdtformatlock">
+          <mc:Fallback xmlns:w16sdtfl="http://schemas.microsoft.com/office/word/2024/wordml/sdtformatlock" xmlns:w16du="http://schemas.microsoft.com/office/word/2023/wordml/word16du">
             <w:pict>
               <v:rect w14:anchorId="2A0A7705" id="docshape13" o:spid="_x0000_s1026" style="position:absolute;margin-left:55.2pt;margin-top:18.2pt;width:484.9pt;height:.5pt;z-index:-15725568;visibility:visible;mso-wrap-style:square;mso-width-percent:0;mso-height-percent:0;mso-wrap-distance-left:0;mso-wrap-distance-top:0;mso-wrap-distance-right:0;mso-wrap-distance-bottom:0;mso-position-horizontal:absolute;mso-position-horizontal-relative:page;mso-position-vertical:absolute;mso-position-vertical-relative:text;mso-width-percent:0;mso-height-percent:0;mso-width-relative:page;mso-height-relative:page;v-text-anchor:top" o:gfxdata="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" fillcolor="black" stroked="f">
                 <w10:wrap type="topAndBottom" anchorx="page"/>
@@ -4206,7 +4213,7 @@
               </wp:inline>
             </w:drawing>
           </mc:Choice>
-          <mc:Fallback xmlns:w16du="http://schemas.microsoft.com/office/word/2023/wordml/word16du" xmlns:w16sdtfl="http://schemas.microsoft.com/office/word/2024/wordml/sdtformatlock">
+          <mc:Fallback xmlns:w16sdtfl="http://schemas.microsoft.com/office/word/2024/wordml/sdtformatlock" xmlns:w16du="http://schemas.microsoft.com/office/word/2023/wordml/word16du">
             <w:pict>
               <v:group w14:anchorId="02693557" id="docshapegroup15" o:spid="_x0000_s1026" style="width:484.95pt;height:.5pt;mso-position-horizontal-relative:char;mso-position-vertical-relative:line" coordsize="9699,10" o:gfxdata="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">
                 <v:rect id="docshape16" o:spid="_x0000_s1027" style="position:absolute;width:9699;height:10;visibility:visible;mso-wrap-style:square;v-text-anchor:top" o:gfxdata="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" fillcolor="black" stroked="f"/>
@@ -4510,7 +4517,7 @@
               </wp:anchor>
             </w:drawing>
           </mc:Choice>
-          <mc:Fallback xmlns:w16du="http://schemas.microsoft.com/office/word/2023/wordml/word16du" xmlns:w16sdtfl="http://schemas.microsoft.com/office/word/2024/wordml/sdtformatlock">
+          <mc:Fallback xmlns:w16sdtfl="http://schemas.microsoft.com/office/word/2024/wordml/sdtformatlock" xmlns:w16du="http://schemas.microsoft.com/office/word/2023/wordml/word16du">
             <w:pict>
               <v:rect w14:anchorId="1F8C973B" id="docshape17" o:spid="_x0000_s1026" style="position:absolute;margin-left:223.25pt;margin-top:12.4pt;width:122.65pt;height:.95pt;z-index:-15724032;visibility:visible;mso-wrap-style:square;mso-width-percent:0;mso-height-percent:0;mso-wrap-distance-left:0;mso-wrap-distance-top:0;mso-wrap-distance-right:0;mso-wrap-distance-bottom:0;mso-position-horizontal:absolute;mso-position-horizontal-relative:page;mso-position-vertical:absolute;mso-position-vertical-relative:text;mso-width-percent:0;mso-height-percent:0;mso-width-relative:page;mso-height-relative:page;v-text-anchor:top" o:gfxdata="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" fillcolor="black" stroked="f">
                 <w10:wrap type="topAndBottom" anchorx="page"/>
@@ -4589,7 +4596,7 @@
               </wp:anchor>
             </w:drawing>
           </mc:Choice>
-          <mc:Fallback xmlns:w16du="http://schemas.microsoft.com/office/word/2023/wordml/word16du" xmlns:w16sdtfl="http://schemas.microsoft.com/office/word/2024/wordml/sdtformatlock">
+          <mc:Fallback xmlns:w16sdtfl="http://schemas.microsoft.com/office/word/2024/wordml/sdtformatlock" xmlns:w16du="http://schemas.microsoft.com/office/word/2023/wordml/word16du">
             <w:pict>
               <v:rect w14:anchorId="5C3318E3" id="docshape18" o:spid="_x0000_s1026" style="position:absolute;margin-left:390.55pt;margin-top:12.4pt;width:122.55pt;height:.95pt;z-index:-15723520;visibility:visible;mso-wrap-style:square;mso-width-percent:0;mso-height-percent:0;mso-wrap-distance-left:0;mso-wrap-distance-top:0;mso-wrap-distance-right:0;mso-wrap-distance-bottom:0;mso-position-horizontal:absolute;mso-position-horizontal-relative:page;mso-position-vertical:absolute;mso-position-vertical-relative:text;mso-width-percent:0;mso-height-percent:0;mso-width-relative:page;mso-height-relative:page;v-text-anchor:top" o:gfxdata="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" fillcolor="black" stroked="f">
                 <w10:wrap type="topAndBottom" anchorx="page"/>

</xml_diff>

<commit_message>
Update QdC, Documentazione & Diari di lavoro
</commit_message>
<xml_diff>
--- a/1_QdC/QdC_PokeCardDex.docx
+++ b/1_QdC/QdC_PokeCardDex.docx
@@ -3242,32 +3242,32 @@
       <w:pPr>
         <w:pStyle w:val="Corpotesto"/>
         <w:numPr>
-          <w:ilvl w:val="2"/>
+          <w:ilvl w:val="1"/>
           <w:numId w:val="10"/>
         </w:numPr>
         <w:spacing w:before="56"/>
       </w:pPr>
       <w:r>
-        <w:t>Di default sarà la parte di mail prima della ‘@’</w:t>
+        <w:t>Aggiungere un modo per il recupero password (confermando l’email si invia ad essa un link per la modif</w:t>
+      </w:r>
+      <w:r>
+        <w:t>ica</w:t>
+      </w:r>
+      <w:r>
+        <w:t xml:space="preserve"> della password)</w:t>
       </w:r>
     </w:p>
     <w:p>
       <w:pPr>
         <w:pStyle w:val="Corpotesto"/>
         <w:numPr>
-          <w:ilvl w:val="3"/>
+          <w:ilvl w:val="0"/>
           <w:numId w:val="10"/>
         </w:numPr>
         <w:spacing w:before="56"/>
       </w:pPr>
       <w:r>
-        <w:t xml:space="preserve">Per il nome utente di default, se la mail è </w:t>
-      </w:r>
-      <w:r>
-        <w:t>pinco.pallino@gmail.com</w:t>
-      </w:r>
-      <w:r>
-        <w:t>, deve essere “pinco pallino”</w:t>
+        <w:t>L’app dovrà salvare solo carte registrate tramite l’ID della carta, se il pokémon sulla carta non è ancora stato registrato l’app lo aggiunge al pokédex nel rispettivo numero</w:t>
       </w:r>
     </w:p>
     <w:p>
@@ -3280,13 +3280,115 @@
         <w:spacing w:before="56"/>
       </w:pPr>
       <w:r>
-        <w:t>Aggiungere un modo per il recupero password (confermando l’email si invia ad essa un link per la modif</w:t>
-      </w:r>
-      <w:r>
-        <w:t>ica</w:t>
-      </w:r>
-      <w:r>
-        <w:t xml:space="preserve"> della password)</w:t>
+        <w:t>L’app deve essere aggiornata all’ultima espansione</w:t>
+      </w:r>
+    </w:p>
+    <w:p>
+      <w:pPr>
+        <w:pStyle w:val="Corpotesto"/>
+        <w:numPr>
+          <w:ilvl w:val="1"/>
+          <w:numId w:val="10"/>
+        </w:numPr>
+        <w:spacing w:before="56"/>
+      </w:pPr>
+      <w:r>
+        <w:t>Es: Utente aggiunge la carta pokémon di Mega Darkrai</w:t>
+      </w:r>
+      <w:r>
+        <w:t xml:space="preserve">-ex con il codice PBL </w:t>
+      </w:r>
+      <w:r>
+        <w:t>101/83</w:t>
+      </w:r>
+      <w:r>
+        <w:t xml:space="preserve">, non ha ancora salvato alcun Darkrai </w:t>
+      </w:r>
+      <w:r>
+        <w:sym w:font="Wingdings" w:char="F0E0"/>
+      </w:r>
+      <w:r>
+        <w:t xml:space="preserve"> Aggiunge Darkrai nel Pokédex</w:t>
+      </w:r>
+    </w:p>
+    <w:p>
+      <w:pPr>
+        <w:pStyle w:val="Corpotesto"/>
+        <w:numPr>
+          <w:ilvl w:val="2"/>
+          <w:numId w:val="10"/>
+        </w:numPr>
+        <w:spacing w:before="56"/>
+      </w:pPr>
+      <w:r>
+        <w:t xml:space="preserve">La ricerca </w:t>
+      </w:r>
+      <w:r>
+        <w:t>e</w:t>
+      </w:r>
+      <w:r>
+        <w:t>strae il nome del pokémon nell’eventualità la carta abbia dettagli extra come Mega</w:t>
+      </w:r>
+      <w:r>
+        <w:t xml:space="preserve"> __ex, ex, di x, etc.</w:t>
+      </w:r>
+      <w:r>
+        <w:t xml:space="preserve"> (Es.: Mega Greninja ex </w:t>
+      </w:r>
+      <w:r>
+        <w:sym w:font="Wingdings" w:char="F0E0"/>
+      </w:r>
+      <w:r>
+        <w:t xml:space="preserve"> Greninja; Metagross di Rocco </w:t>
+      </w:r>
+      <w:r>
+        <w:sym w:font="Wingdings" w:char="F0E0"/>
+      </w:r>
+      <w:r>
+        <w:t xml:space="preserve"> Metagross)</w:t>
+      </w:r>
+    </w:p>
+    <w:p>
+      <w:pPr>
+        <w:pStyle w:val="Corpotesto"/>
+        <w:numPr>
+          <w:ilvl w:val="2"/>
+          <w:numId w:val="10"/>
+        </w:numPr>
+        <w:spacing w:before="56"/>
+      </w:pPr>
+      <w:r>
+        <w:t xml:space="preserve">La carta viene salvata secondo le </w:t>
+      </w:r>
+      <w:r>
+        <w:t>necessità</w:t>
+      </w:r>
+      <w:r>
+        <w:t xml:space="preserve"> dell’api “</w:t>
+      </w:r>
+      <w:r>
+        <w:t>tcgdex.dev</w:t>
+      </w:r>
+      <w:r>
+        <w:t xml:space="preserve">”, PBL </w:t>
+      </w:r>
+      <w:r>
+        <w:t>101/83</w:t>
+      </w:r>
+      <w:r>
+        <w:t xml:space="preserve"> </w:t>
+      </w:r>
+      <w:r>
+        <w:sym w:font="Wingdings" w:char="F0E0"/>
+      </w:r>
+      <w:r>
+        <w:t xml:space="preserve"> espansione principale: Megaevoluzione (me), espansione: Buio Pesto (</w:t>
+      </w:r>
+      <w:r>
+        <w:t>Pitch</w:t>
+      </w:r>
+      <w:r>
+        <w:t xml:space="preserve"> Black) (me03), numero carta: 101</w:t>
       </w:r>
     </w:p>
     <w:p>
@@ -3299,7 +3401,35 @@
         <w:spacing w:before="56"/>
       </w:pPr>
       <w:r>
-        <w:t>L’app dovrà salvare solo carte registrate tramite l’ID della carta, se il pokémon sulla carta non è ancora stato registrato l’app lo aggiunge al pokédex nel rispettivo numero</w:t>
+        <w:t xml:space="preserve">L’app deve mostrare il valore </w:t>
+      </w:r>
+      <w:r>
+        <w:t>medio</w:t>
+      </w:r>
+      <w:r>
+        <w:t xml:space="preserve"> </w:t>
+      </w:r>
+      <w:r>
+        <w:t xml:space="preserve">della carta </w:t>
+      </w:r>
+      <w:r>
+        <w:t>secondo Cardmarket (Il più grande mercato europeo di carte collezionabili) in Fr.-</w:t>
+      </w:r>
+    </w:p>
+    <w:p>
+      <w:pPr>
+        <w:pStyle w:val="Corpotesto"/>
+        <w:numPr>
+          <w:ilvl w:val="0"/>
+          <w:numId w:val="10"/>
+        </w:numPr>
+        <w:spacing w:before="56"/>
+      </w:pPr>
+      <w:r>
+        <w:t>L’app deve simulare un pokédex mostrando nome e immagine di anteprima dei pokémon “scoperti” mentre per quelli dei pokémon non scoperti deve apparire solo il numero del pokédex e un punto d’interrogazione</w:t>
+      </w:r>
+      <w:r>
+        <w:t>.</w:t>
       </w:r>
     </w:p>
     <w:p>
@@ -3312,35 +3442,7 @@
         <w:spacing w:before="56"/>
       </w:pPr>
       <w:r>
-        <w:t>L’app deve essere aggiornata all’ultima espansione</w:t>
-      </w:r>
-    </w:p>
-    <w:p>
-      <w:pPr>
-        <w:pStyle w:val="Corpotesto"/>
-        <w:numPr>
-          <w:ilvl w:val="1"/>
-          <w:numId w:val="10"/>
-        </w:numPr>
-        <w:spacing w:before="56"/>
-      </w:pPr>
-      <w:r>
-        <w:t>Es: Utente aggiunge la carta pokémon di Mega Darkrai</w:t>
-      </w:r>
-      <w:r>
-        <w:t xml:space="preserve">-ex con il codice PBL </w:t>
-      </w:r>
-      <w:r>
-        <w:t>101/83</w:t>
-      </w:r>
-      <w:r>
-        <w:t xml:space="preserve">, non ha ancora salvato alcun Darkrai </w:t>
-      </w:r>
-      <w:r>
-        <w:sym w:font="Wingdings" w:char="F0E0"/>
-      </w:r>
-      <w:r>
-        <w:t xml:space="preserve"> Aggiunge Darkrai nel Pokédex</w:t>
+        <w:t>Selezionando sul pokémon si deve aprire un’overview del pokémon che includa una sua immagine, le descrizioni delle carte, il suo tipo e eventuali evoluzioni o pre-evoluzioni o forme alternative (Incluse Mega evoluzioni)</w:t>
       </w:r>
     </w:p>
     <w:p>
@@ -3353,31 +3455,7 @@
         <w:spacing w:before="56"/>
       </w:pPr>
       <w:r>
-        <w:t xml:space="preserve">La ricerca </w:t>
-      </w:r>
-      <w:r>
-        <w:t>e</w:t>
-      </w:r>
-      <w:r>
-        <w:t>strae il nome del pokémon nell’eventualità la carta abbia dettagli extra come Mega</w:t>
-      </w:r>
-      <w:r>
-        <w:t xml:space="preserve"> __ex, ex, di x, etc.</w:t>
-      </w:r>
-      <w:r>
-        <w:t xml:space="preserve"> (Es.: Mega Greninja ex </w:t>
-      </w:r>
-      <w:r>
-        <w:sym w:font="Wingdings" w:char="F0E0"/>
-      </w:r>
-      <w:r>
-        <w:t xml:space="preserve"> Greninja; Metagross di Rocco </w:t>
-      </w:r>
-      <w:r>
-        <w:sym w:font="Wingdings" w:char="F0E0"/>
-      </w:r>
-      <w:r>
-        <w:t xml:space="preserve"> Metagross)</w:t>
+        <w:t>Le evoluzioni e pre-evoluzioni devono includere un collegamento ad esse</w:t>
       </w:r>
     </w:p>
     <w:p>
@@ -3390,82 +3468,7 @@
         <w:spacing w:before="56"/>
       </w:pPr>
       <w:r>
-        <w:t xml:space="preserve">La carta viene salvata secondo le </w:t>
-      </w:r>
-      <w:r>
-        <w:t>necessità</w:t>
-      </w:r>
-      <w:r>
-        <w:t xml:space="preserve"> dell’api “</w:t>
-      </w:r>
-      <w:r>
-        <w:t>tcgdex.dev</w:t>
-      </w:r>
-      <w:r>
-        <w:t xml:space="preserve">”, PBL </w:t>
-      </w:r>
-      <w:r>
-        <w:t>101/83</w:t>
-      </w:r>
-      <w:r>
-        <w:t xml:space="preserve"> </w:t>
-      </w:r>
-      <w:r>
-        <w:sym w:font="Wingdings" w:char="F0E0"/>
-      </w:r>
-      <w:r>
-        <w:t xml:space="preserve"> espansione principale: Megaevoluzione (me), espansione: Buio Pesto (</w:t>
-      </w:r>
-      <w:r>
-        <w:t>Pitch</w:t>
-      </w:r>
-      <w:r>
-        <w:t xml:space="preserve"> Black) (me03), numero carta: 101</w:t>
-      </w:r>
-    </w:p>
-    <w:p>
-      <w:pPr>
-        <w:pStyle w:val="Corpotesto"/>
-        <w:numPr>
-          <w:ilvl w:val="0"/>
-          <w:numId w:val="10"/>
-        </w:numPr>
-        <w:spacing w:before="56"/>
-      </w:pPr>
-      <w:r>
-        <w:t xml:space="preserve">L’app deve mostrare il valore della carta </w:t>
-      </w:r>
-      <w:r>
-        <w:t>medio secondo Cardmarket (Il più grande mercato europeo di carte collezionabili) in Fr.-</w:t>
-      </w:r>
-    </w:p>
-    <w:p>
-      <w:pPr>
-        <w:pStyle w:val="Corpotesto"/>
-        <w:numPr>
-          <w:ilvl w:val="0"/>
-          <w:numId w:val="10"/>
-        </w:numPr>
-        <w:spacing w:before="56"/>
-      </w:pPr>
-      <w:r>
-        <w:t>L’app deve simulare un pokédex mostrando nome e immagine di anteprima dei pokémon “scoperti” mentre per quelli dei pokémon non scoperti deve apparire solo il numero del pokédex e un punto d’interrogazione</w:t>
-      </w:r>
-      <w:r>
-        <w:t>.</w:t>
-      </w:r>
-    </w:p>
-    <w:p>
-      <w:pPr>
-        <w:pStyle w:val="Corpotesto"/>
-        <w:numPr>
-          <w:ilvl w:val="1"/>
-          <w:numId w:val="10"/>
-        </w:numPr>
-        <w:spacing w:before="56"/>
-      </w:pPr>
-      <w:r>
-        <w:t>Selezionando sul pokémon si deve aprire un’overview del pokémon che includa una sua immagine, le descrizioni delle carte, il suo tipo e eventuali evoluzioni o pre-evoluzioni o forme alternative (Incluse Mega evoluzioni)</w:t>
+        <w:t>Se il pokémon non è stato sbloccato la sua scheda deve essere vuota (Punti di domanda la posto dei dati base, nessun collegamento a evoluzioni e pre-evoluzioni e un punto di domanda la posto dell’immagine)</w:t>
       </w:r>
     </w:p>
     <w:p>
@@ -3478,37 +3481,11 @@
         <w:spacing w:before="56"/>
       </w:pPr>
       <w:r>
-        <w:t>Le evoluzioni e pre-evoluzioni devono includere un collegamento ad esse</w:t>
-      </w:r>
-    </w:p>
-    <w:p>
-      <w:pPr>
-        <w:pStyle w:val="Corpotesto"/>
-        <w:numPr>
-          <w:ilvl w:val="2"/>
-          <w:numId w:val="10"/>
-        </w:numPr>
-        <w:spacing w:before="56"/>
-      </w:pPr>
-      <w:r>
-        <w:t xml:space="preserve">Se il pokémon non è stato sbloccato la sua scheda deve essere vuota (Punti di domanda la posto dei dati base, nessun collegamento a evoluzioni e pre-evoluzioni </w:t>
+        <w:t xml:space="preserve">Se ho già uno Squirtle dell’espansione Scarlatto e Violetto – 151 e aggiungo uno dell’espansione Megaevoluzione – Promo, la descrizione di quest’ultimo deve </w:t>
       </w:r>
       <w:r>
         <w:lastRenderedPageBreak/>
-        <w:t>e un punto di domanda la posto dell’immagine)</w:t>
-      </w:r>
-    </w:p>
-    <w:p>
-      <w:pPr>
-        <w:pStyle w:val="Corpotesto"/>
-        <w:numPr>
-          <w:ilvl w:val="2"/>
-          <w:numId w:val="10"/>
-        </w:numPr>
-        <w:spacing w:before="56"/>
-      </w:pPr>
-      <w:r>
-        <w:t>Se ho già uno Squirtle dell’espansione Scarlatto e Violetto – 151 e aggiungo uno dell’espansione Megaevoluzione – Promo, la descrizione di quest’ultimo deve essere aggiunta alla descrizione del pokémon</w:t>
+        <w:t>essere aggiunta alla descrizione del pokémon</w:t>
       </w:r>
     </w:p>
     <w:p>
@@ -4074,16 +4051,6 @@
         </w:rPr>
         <w:t>a fine della lezione</w:t>
       </w:r>
-    </w:p>
-    <w:p>
-      <w:pPr>
-        <w:pStyle w:val="western"/>
-        <w:spacing w:before="0" w:beforeAutospacing="0" w:after="0"/>
-        <w:rPr>
-          <w:rFonts w:ascii="Calibri" w:eastAsia="Calibri" w:hAnsi="Calibri" w:cs="Calibri"/>
-          <w:lang w:val="it-IT" w:eastAsia="en-US"/>
-        </w:rPr>
-      </w:pPr>
     </w:p>
     <w:p>
       <w:pPr>

</xml_diff>

<commit_message>
Update docu e QdC
</commit_message>
<xml_diff>
--- a/1_QdC/QdC_PokeCardDex.docx
+++ b/1_QdC/QdC_PokeCardDex.docx
@@ -94,7 +94,7 @@
               </wp:inline>
             </w:drawing>
           </mc:Choice>
-          <mc:Fallback xmlns:w16sdtfl="http://schemas.microsoft.com/office/word/2024/wordml/sdtformatlock" xmlns:w16du="http://schemas.microsoft.com/office/word/2023/wordml/word16du">
+          <mc:Fallback xmlns:w16du="http://schemas.microsoft.com/office/word/2023/wordml/word16du" xmlns:w16sdtfl="http://schemas.microsoft.com/office/word/2024/wordml/sdtformatlock">
             <w:pict>
               <v:group w14:anchorId="70E73CBE" id="docshapegroup5" o:spid="_x0000_s1026" style="width:484.95pt;height:.5pt;mso-position-horizontal-relative:char;mso-position-vertical-relative:line" coordsize="9699,10" o:gfxdata="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">
                 <v:rect id="docshape6" o:spid="_x0000_s1027" style="position:absolute;width:9699;height:10;visibility:visible;mso-wrap-style:square;v-text-anchor:top" o:gfxdata="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" fillcolor="black" stroked="f"/>
@@ -1666,7 +1666,7 @@
               </wp:anchor>
             </w:drawing>
           </mc:Choice>
-          <mc:Fallback xmlns:w16sdtfl="http://schemas.microsoft.com/office/word/2024/wordml/sdtformatlock" xmlns:w16du="http://schemas.microsoft.com/office/word/2023/wordml/word16du">
+          <mc:Fallback xmlns:w16du="http://schemas.microsoft.com/office/word/2023/wordml/word16du" xmlns:w16sdtfl="http://schemas.microsoft.com/office/word/2024/wordml/sdtformatlock">
             <w:pict>
               <v:rect w14:anchorId="7AF32B45" id="docshape7" o:spid="_x0000_s1026" style="position:absolute;margin-left:55.2pt;margin-top:18.6pt;width:484.9pt;height:.5pt;z-index:-15728128;visibility:visible;mso-wrap-style:square;mso-width-percent:0;mso-height-percent:0;mso-wrap-distance-left:0;mso-wrap-distance-top:0;mso-wrap-distance-right:0;mso-wrap-distance-bottom:0;mso-position-horizontal:absolute;mso-position-horizontal-relative:page;mso-position-vertical:absolute;mso-position-vertical-relative:text;mso-width-percent:0;mso-height-percent:0;mso-width-relative:page;mso-height-relative:page;v-text-anchor:top" o:gfxdata="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" fillcolor="black" stroked="f">
                 <w10:wrap type="topAndBottom" anchorx="page"/>
@@ -2635,7 +2635,7 @@
               </wp:inline>
             </w:drawing>
           </mc:Choice>
-          <mc:Fallback xmlns:w16sdtfl="http://schemas.microsoft.com/office/word/2024/wordml/sdtformatlock" xmlns:w16du="http://schemas.microsoft.com/office/word/2023/wordml/word16du">
+          <mc:Fallback xmlns:w16du="http://schemas.microsoft.com/office/word/2023/wordml/word16du" xmlns:w16sdtfl="http://schemas.microsoft.com/office/word/2024/wordml/sdtformatlock">
             <w:pict>
               <v:group w14:anchorId="2E328116" id="docshapegroup8" o:spid="_x0000_s1026" style="width:484.95pt;height:.5pt;mso-position-horizontal-relative:char;mso-position-vertical-relative:line" coordsize="9699,10" o:gfxdata="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">
                 <v:rect id="docshape9" o:spid="_x0000_s1027" style="position:absolute;width:9699;height:10;visibility:visible;mso-wrap-style:square;v-text-anchor:top" o:gfxdata="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" fillcolor="black" stroked="f"/>
@@ -2765,7 +2765,7 @@
               </wp:anchor>
             </w:drawing>
           </mc:Choice>
-          <mc:Fallback xmlns:w16sdtfl="http://schemas.microsoft.com/office/word/2024/wordml/sdtformatlock" xmlns:w16du="http://schemas.microsoft.com/office/word/2023/wordml/word16du">
+          <mc:Fallback xmlns:w16du="http://schemas.microsoft.com/office/word/2023/wordml/word16du" xmlns:w16sdtfl="http://schemas.microsoft.com/office/word/2024/wordml/sdtformatlock">
             <w:pict>
               <v:rect w14:anchorId="73131EAD" id="docshape10" o:spid="_x0000_s1026" style="position:absolute;margin-left:55.2pt;margin-top:18.05pt;width:484.9pt;height:.5pt;z-index:-15721472;visibility:visible;mso-wrap-style:square;mso-width-percent:0;mso-height-percent:0;mso-wrap-distance-left:0;mso-wrap-distance-top:0;mso-wrap-distance-right:0;mso-wrap-distance-bottom:0;mso-position-horizontal:absolute;mso-position-horizontal-relative:page;mso-position-vertical:absolute;mso-position-vertical-relative:text;mso-width-percent:0;mso-height-percent:0;mso-width-relative:page;mso-height-relative:page;v-text-anchor:top" o:gfxdata="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" fillcolor="black" stroked="f">
                 <w10:wrap type="topAndBottom" anchorx="page"/>
@@ -2921,7 +2921,7 @@
               </wp:anchor>
             </w:drawing>
           </mc:Choice>
-          <mc:Fallback xmlns:w16sdtfl="http://schemas.microsoft.com/office/word/2024/wordml/sdtformatlock" xmlns:w16du="http://schemas.microsoft.com/office/word/2023/wordml/word16du">
+          <mc:Fallback xmlns:w16du="http://schemas.microsoft.com/office/word/2023/wordml/word16du" xmlns:w16sdtfl="http://schemas.microsoft.com/office/word/2024/wordml/sdtformatlock">
             <w:pict>
               <v:rect w14:anchorId="1A8AD331" id="docshape11" o:spid="_x0000_s1026" style="position:absolute;margin-left:55.2pt;margin-top:18.1pt;width:484.9pt;height:.5pt;z-index:-15720448;visibility:visible;mso-wrap-style:square;mso-width-percent:0;mso-height-percent:0;mso-wrap-distance-left:0;mso-wrap-distance-top:0;mso-wrap-distance-right:0;mso-wrap-distance-bottom:0;mso-position-horizontal:absolute;mso-position-horizontal-relative:page;mso-position-vertical:absolute;mso-position-vertical-relative:text;mso-width-percent:0;mso-height-percent:0;mso-width-relative:page;mso-height-relative:page;v-text-anchor:top" o:gfxdata="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" fillcolor="black" stroked="f">
                 <w10:wrap type="topAndBottom" anchorx="page"/>
@@ -3056,7 +3056,7 @@
               </wp:anchor>
             </w:drawing>
           </mc:Choice>
-          <mc:Fallback xmlns:w16sdtfl="http://schemas.microsoft.com/office/word/2024/wordml/sdtformatlock" xmlns:w16du="http://schemas.microsoft.com/office/word/2023/wordml/word16du">
+          <mc:Fallback xmlns:w16du="http://schemas.microsoft.com/office/word/2023/wordml/word16du" xmlns:w16sdtfl="http://schemas.microsoft.com/office/word/2024/wordml/sdtformatlock">
             <w:pict>
               <v:rect w14:anchorId="48EE7F19" id="docshape12" o:spid="_x0000_s1026" style="position:absolute;margin-left:55.2pt;margin-top:18.1pt;width:484.9pt;height:.5pt;z-index:-15719424;visibility:visible;mso-wrap-style:square;mso-width-percent:0;mso-height-percent:0;mso-wrap-distance-left:0;mso-wrap-distance-top:0;mso-wrap-distance-right:0;mso-wrap-distance-bottom:0;mso-position-horizontal:absolute;mso-position-horizontal-relative:page;mso-position-vertical:absolute;mso-position-vertical-relative:text;mso-width-percent:0;mso-height-percent:0;mso-width-relative:page;mso-height-relative:page;v-text-anchor:top" o:gfxdata="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" fillcolor="black" stroked="f">
                 <w10:wrap type="topAndBottom" anchorx="page"/>
@@ -3404,10 +3404,7 @@
         <w:t xml:space="preserve">L’app deve mostrare il valore </w:t>
       </w:r>
       <w:r>
-        <w:t>medio</w:t>
-      </w:r>
-      <w:r>
-        <w:t xml:space="preserve"> </w:t>
+        <w:t xml:space="preserve">medio </w:t>
       </w:r>
       <w:r>
         <w:t xml:space="preserve">della carta </w:t>
@@ -3502,170 +3499,6 @@
       </w:r>
       <w:r>
         <w:t xml:space="preserve"> con il numero 2</w:t>
-      </w:r>
-    </w:p>
-    <w:p>
-      <w:pPr>
-        <w:pStyle w:val="Corpotesto"/>
-        <w:spacing w:before="56"/>
-        <w:rPr>
-          <w:b/>
-          <w:bCs/>
-        </w:rPr>
-      </w:pPr>
-      <w:r>
-        <w:rPr>
-          <w:b/>
-          <w:bCs/>
-        </w:rPr>
-        <w:t>Banche dati</w:t>
-      </w:r>
-      <w:r>
-        <w:rPr>
-          <w:b/>
-          <w:bCs/>
-        </w:rPr>
-        <w:t>:</w:t>
-      </w:r>
-    </w:p>
-    <w:p>
-      <w:pPr>
-        <w:pStyle w:val="Corpotesto"/>
-        <w:numPr>
-          <w:ilvl w:val="0"/>
-          <w:numId w:val="11"/>
-        </w:numPr>
-        <w:spacing w:before="56"/>
-      </w:pPr>
-      <w:r>
-        <w:t>Le banche dati</w:t>
-      </w:r>
-      <w:r>
-        <w:t xml:space="preserve"> per le carte e i Pokémon verranno fornite dalle api di “tcgdex.dev” e “pokeapi.co”</w:t>
-      </w:r>
-    </w:p>
-    <w:p>
-      <w:pPr>
-        <w:pStyle w:val="Corpotesto"/>
-        <w:numPr>
-          <w:ilvl w:val="0"/>
-          <w:numId w:val="11"/>
-        </w:numPr>
-        <w:spacing w:before="56"/>
-      </w:pPr>
-      <w:r>
-        <w:t>Il database con i dati degli utenti sarà creato in SQL con uso di PHP</w:t>
-      </w:r>
-    </w:p>
-    <w:p>
-      <w:pPr>
-        <w:pStyle w:val="Corpotesto"/>
-        <w:numPr>
-          <w:ilvl w:val="0"/>
-          <w:numId w:val="11"/>
-        </w:numPr>
-        <w:spacing w:before="56"/>
-      </w:pPr>
-      <w:r>
-        <w:t>Le carte possedute dagli utenti saranno salvate in formato JSON</w:t>
-      </w:r>
-    </w:p>
-    <w:p>
-      <w:pPr>
-        <w:pStyle w:val="Corpotesto"/>
-        <w:spacing w:before="56"/>
-        <w:rPr>
-          <w:b/>
-          <w:bCs/>
-        </w:rPr>
-      </w:pPr>
-      <w:r>
-        <w:rPr>
-          <w:b/>
-          <w:bCs/>
-        </w:rPr>
-        <w:t>Linguaggi di programmazione</w:t>
-      </w:r>
-      <w:r>
-        <w:rPr>
-          <w:b/>
-          <w:bCs/>
-        </w:rPr>
-        <w:t>:</w:t>
-      </w:r>
-    </w:p>
-    <w:p>
-      <w:pPr>
-        <w:pStyle w:val="Corpotesto"/>
-        <w:spacing w:before="56"/>
-      </w:pPr>
-      <w:r>
-        <w:t>Nel sito verranno usati i seguenti linguaggi:</w:t>
-      </w:r>
-    </w:p>
-    <w:p>
-      <w:pPr>
-        <w:pStyle w:val="Corpotesto"/>
-        <w:numPr>
-          <w:ilvl w:val="0"/>
-          <w:numId w:val="12"/>
-        </w:numPr>
-        <w:spacing w:before="56"/>
-      </w:pPr>
-      <w:r>
-        <w:t>HTML: Linguaggio usato per il Front-end dei siti o applicativi web</w:t>
-      </w:r>
-    </w:p>
-    <w:p>
-      <w:pPr>
-        <w:pStyle w:val="Corpotesto"/>
-        <w:numPr>
-          <w:ilvl w:val="0"/>
-          <w:numId w:val="12"/>
-        </w:numPr>
-        <w:spacing w:before="56"/>
-      </w:pPr>
-      <w:r>
-        <w:t>CSS: Linguaggio usato per il design del Front-end dei siti o applicativi web</w:t>
-      </w:r>
-    </w:p>
-    <w:p>
-      <w:pPr>
-        <w:pStyle w:val="Corpotesto"/>
-        <w:numPr>
-          <w:ilvl w:val="0"/>
-          <w:numId w:val="12"/>
-        </w:numPr>
-        <w:spacing w:before="56"/>
-      </w:pPr>
-      <w:r>
-        <w:t>JavaScript: Linguaggio usato per il back-end dei siti o applicativi web, nonché usato un sacco per uso di API e file JSON</w:t>
-      </w:r>
-    </w:p>
-    <w:p>
-      <w:pPr>
-        <w:pStyle w:val="Corpotesto"/>
-        <w:numPr>
-          <w:ilvl w:val="0"/>
-          <w:numId w:val="12"/>
-        </w:numPr>
-        <w:spacing w:before="56"/>
-      </w:pPr>
-      <w:r>
-        <w:t>SQL: Linguaggio usato per creazione e gestione di banche dati</w:t>
-      </w:r>
-    </w:p>
-    <w:p>
-      <w:pPr>
-        <w:pStyle w:val="Corpotesto"/>
-        <w:numPr>
-          <w:ilvl w:val="0"/>
-          <w:numId w:val="12"/>
-        </w:numPr>
-        <w:spacing w:before="56"/>
-      </w:pPr>
-      <w:r>
-        <w:t>PHP: Linguaggio usato per lo scambio di dati tra SQL e HTML/JavaScript</w:t>
       </w:r>
     </w:p>
     <w:p>
@@ -3747,7 +3580,7 @@
               </wp:anchor>
             </w:drawing>
           </mc:Choice>
-          <mc:Fallback xmlns:w16sdtfl="http://schemas.microsoft.com/office/word/2024/wordml/sdtformatlock" xmlns:w16du="http://schemas.microsoft.com/office/word/2023/wordml/word16du">
+          <mc:Fallback xmlns:w16du="http://schemas.microsoft.com/office/word/2023/wordml/word16du" xmlns:w16sdtfl="http://schemas.microsoft.com/office/word/2024/wordml/sdtformatlock">
             <w:pict>
               <v:rect w14:anchorId="2A0A7705" id="docshape13" o:spid="_x0000_s1026" style="position:absolute;margin-left:55.2pt;margin-top:18.2pt;width:484.9pt;height:.5pt;z-index:-15725568;visibility:visible;mso-wrap-style:square;mso-width-percent:0;mso-height-percent:0;mso-wrap-distance-left:0;mso-wrap-distance-top:0;mso-wrap-distance-right:0;mso-wrap-distance-bottom:0;mso-position-horizontal:absolute;mso-position-horizontal-relative:page;mso-position-vertical:absolute;mso-position-vertical-relative:text;mso-width-percent:0;mso-height-percent:0;mso-width-relative:page;mso-height-relative:page;v-text-anchor:top" o:gfxdata="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" fillcolor="black" stroked="f">
                 <w10:wrap type="topAndBottom" anchorx="page"/>
@@ -4180,7 +4013,7 @@
               </wp:inline>
             </w:drawing>
           </mc:Choice>
-          <mc:Fallback xmlns:w16sdtfl="http://schemas.microsoft.com/office/word/2024/wordml/sdtformatlock" xmlns:w16du="http://schemas.microsoft.com/office/word/2023/wordml/word16du">
+          <mc:Fallback xmlns:w16du="http://schemas.microsoft.com/office/word/2023/wordml/word16du" xmlns:w16sdtfl="http://schemas.microsoft.com/office/word/2024/wordml/sdtformatlock">
             <w:pict>
               <v:group w14:anchorId="02693557" id="docshapegroup15" o:spid="_x0000_s1026" style="width:484.95pt;height:.5pt;mso-position-horizontal-relative:char;mso-position-vertical-relative:line" coordsize="9699,10" o:gfxdata="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">
                 <v:rect id="docshape16" o:spid="_x0000_s1027" style="position:absolute;width:9699;height:10;visibility:visible;mso-wrap-style:square;v-text-anchor:top" o:gfxdata="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" fillcolor="black" stroked="f"/>
@@ -4484,7 +4317,7 @@
               </wp:anchor>
             </w:drawing>
           </mc:Choice>
-          <mc:Fallback xmlns:w16sdtfl="http://schemas.microsoft.com/office/word/2024/wordml/sdtformatlock" xmlns:w16du="http://schemas.microsoft.com/office/word/2023/wordml/word16du">
+          <mc:Fallback xmlns:w16du="http://schemas.microsoft.com/office/word/2023/wordml/word16du" xmlns:w16sdtfl="http://schemas.microsoft.com/office/word/2024/wordml/sdtformatlock">
             <w:pict>
               <v:rect w14:anchorId="1F8C973B" id="docshape17" o:spid="_x0000_s1026" style="position:absolute;margin-left:223.25pt;margin-top:12.4pt;width:122.65pt;height:.95pt;z-index:-15724032;visibility:visible;mso-wrap-style:square;mso-width-percent:0;mso-height-percent:0;mso-wrap-distance-left:0;mso-wrap-distance-top:0;mso-wrap-distance-right:0;mso-wrap-distance-bottom:0;mso-position-horizontal:absolute;mso-position-horizontal-relative:page;mso-position-vertical:absolute;mso-position-vertical-relative:text;mso-width-percent:0;mso-height-percent:0;mso-width-relative:page;mso-height-relative:page;v-text-anchor:top" o:gfxdata="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" fillcolor="black" stroked="f">
                 <w10:wrap type="topAndBottom" anchorx="page"/>
@@ -4563,7 +4396,7 @@
               </wp:anchor>
             </w:drawing>
           </mc:Choice>
-          <mc:Fallback xmlns:w16sdtfl="http://schemas.microsoft.com/office/word/2024/wordml/sdtformatlock" xmlns:w16du="http://schemas.microsoft.com/office/word/2023/wordml/word16du">
+          <mc:Fallback xmlns:w16du="http://schemas.microsoft.com/office/word/2023/wordml/word16du" xmlns:w16sdtfl="http://schemas.microsoft.com/office/word/2024/wordml/sdtformatlock">
             <w:pict>
               <v:rect w14:anchorId="5C3318E3" id="docshape18" o:spid="_x0000_s1026" style="position:absolute;margin-left:390.55pt;margin-top:12.4pt;width:122.55pt;height:.95pt;z-index:-15723520;visibility:visible;mso-wrap-style:square;mso-width-percent:0;mso-height-percent:0;mso-wrap-distance-left:0;mso-wrap-distance-top:0;mso-wrap-distance-right:0;mso-wrap-distance-bottom:0;mso-position-horizontal:absolute;mso-position-horizontal-relative:page;mso-position-vertical:absolute;mso-position-vertical-relative:text;mso-width-percent:0;mso-height-percent:0;mso-width-relative:page;mso-height-relative:page;v-text-anchor:top" o:gfxdata="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" fillcolor="black" stroked="f">
                 <w10:wrap type="topAndBottom" anchorx="page"/>

</xml_diff>